<commit_message>
CIP: change approved, Trinity DHCP scopes confirmed
Co-Authored-By: Claude Opus 5.5 <noreply@anthropic.com>
Claude-Session: https://claude.ai/code/session_01BZ7jJsE6GWKm6ehHY39VNr
</commit_message>
<xml_diff>
--- a/Trinity 200V DHCP Helper Change.docx
+++ b/Trinity 200V DHCP Helper Change.docx
@@ -663,7 +663,7 @@
                 <w:sz w:val="20"/>
                 <w:szCs w:val="20"/>
               </w:rPr>
-              <w:t xml:space="preserve">Pending</w:t>
+              <w:t xml:space="preserve">Complete (confirmed by Trinity)</w:t>
             </w:r>
           </w:p>
         </w:tc>
@@ -780,7 +780,7 @@
                 <w:sz w:val="20"/>
                 <w:szCs w:val="20"/>
               </w:rPr>
-              <w:t xml:space="preserve">Pending</w:t>
+              <w:t xml:space="preserve">Complete</w:t>
             </w:r>
           </w:p>
         </w:tc>

</xml_diff>